<commit_message>
Pitch pack: new prices, stickman Shorts + long-form grouped, bodyguard samples, retention-only proof
Co-Authored-By: Claude Opus 5.5 <noreply@anthropic.com>
Claude-Session: https://claude.ai/code/session_016Kn8VWvmemnKq8yyyzheZb
</commit_message>
<xml_diff>
--- a/work/client_pack/Client_Pitch_Pack.docx
+++ b/work/client_pack/Client_Pitch_Pack.docx
@@ -24,7 +24,7 @@
     </w:p>
     <w:p>
       <w:r>
-        <w:t>We make four kinds of video. Three are produced with our own in-house animation pipeline: the script, voiceover, every scene, captions, music and sound effects. That keeps them fast and affordable. The fourth is a premium Blender service for clients who want the cinematic, viral 3D Shorts look.</w:t>
+        <w:t>We offer three styles. Stickman POV animation comes as Shorts or long-form YouTube videos, and there are also low-poly 3D what-if Shorts. All three are produced with our own in-house animation pipeline: the script, voiceover, every scene, captions, music and sound effects. That keeps them fast and affordable. On top of that, we offer a premium Blender service for clients who want the cinematic, viral 3D Shorts look.</w:t>
       </w:r>
     </w:p>
     <w:p>
@@ -51,10 +51,10 @@
         <w:rPr>
           <w:b/>
         </w:rPr>
-        <w:t xml:space="preserve">20K views in 36 hours: </w:t>
+        <w:t xml:space="preserve">102% retention: </w:t>
       </w:r>
       <w:r>
-        <w:t>“Gravity Got Fired”, a low-poly 3D what-if Short from my own channel, got 102% retention (viewers rewatched it).</w:t>
+        <w:t>“Gravity Got Fired”, a low-poly 3D what-if Short from my own channel. Viewers watched it to the end and replayed it.</w:t>
       </w:r>
     </w:p>
     <w:p>
@@ -65,10 +65,10 @@
         <w:rPr>
           <w:b/>
         </w:rPr>
-        <w:t xml:space="preserve">8.5-minute long-form story: </w:t>
+        <w:t xml:space="preserve">8:45 long-form POV story: </w:t>
       </w:r>
       <w:r>
-        <w:t>“POV: DUNKI”, a full Urdu second-person stickman story about illegal migration: 4 sections with music and SFX, plus a thumbnail.</w:t>
+        <w:t>“POV: You're a Dictator's Personal Bodyguard”, a full stickman POV story in 4 sections with music, SFX, a thumbnail and a Premiere timeline.</w:t>
       </w:r>
     </w:p>
     <w:p>
@@ -82,7 +82,7 @@
         <w:t xml:space="preserve">Own channels in this format: </w:t>
       </w:r>
       <w:r>
-        <w:t>Doodle POV (English stickman POV stories) plus an Urdu stickman channel. We make this content for ourselves, not just for clients.</w:t>
+        <w:t>Doodle POV, our English stickman POV story channel. We make this content for ourselves, not just for clients.</w:t>
       </w:r>
     </w:p>
     <w:p>
@@ -203,7 +203,7 @@
           </w:tcPr>
           <w:p>
             <w:r>
-              <w:t>$35 – $90 per Short</w:t>
+              <w:t>$35 – $45 per minute</w:t>
             </w:r>
           </w:p>
         </w:tc>
@@ -235,7 +235,7 @@
           </w:tcPr>
           <w:p>
             <w:r>
-              <w:t>Second-Person “POV: You're…” Animated Story Videos</w:t>
+              <w:t>Long-Form Stickman POV Animated Videos</w:t>
             </w:r>
           </w:p>
         </w:tc>
@@ -245,7 +245,7 @@
           </w:tcPr>
           <w:p>
             <w:r>
-              <w:t>$180 – $450 per video</w:t>
+              <w:t>$30 per minute (8 min = $240)</w:t>
             </w:r>
           </w:p>
         </w:tc>
@@ -287,7 +287,7 @@
           </w:tcPr>
           <w:p>
             <w:r>
-              <w:t>$50 – $120 per Short</w:t>
+              <w:t>$50 per Short</w:t>
             </w:r>
           </w:p>
         </w:tc>
@@ -595,6 +595,14 @@
       </w:r>
     </w:p>
     <w:p>
+      <w:r>
+        <w:rPr>
+          <w:b/>
+        </w:rPr>
+        <w:t>PART 1 · STICKMAN POV ANIMATION · SECTION 1 OF 2: SHORTS</w:t>
+      </w:r>
+    </w:p>
+    <w:p>
       <w:pPr>
         <w:pStyle w:val="Heading1"/>
       </w:pPr>
@@ -766,7 +774,7 @@
         <w:rPr>
           <w:b/>
         </w:rPr>
-        <w:t>Faceless channel stuck at low views? I make hand-drawn stickman “POV” Shorts that people watch to the end. You get the script, voiceover, captions, music and SFX, all done for you. A 60-second Short starts at $60 and arrives in 48 hours. Want a free sample frame of your first scene?</w:t>
+        <w:t>Faceless channel stuck at low views? I make hand-drawn stickman “POV” Shorts that people watch to the end. You get the script, voiceover, captions, music and SFX, all done for you. A Short costs $35–45 per minute and arrives in 48 hours. Want a free sample frame of your first scene?</w:t>
       </w:r>
     </w:p>
     <w:p>
@@ -994,7 +1002,7 @@
           </w:tcPr>
           <w:p>
             <w:r>
-              <w:t>$35</w:t>
+              <w:t>$35/min</w:t>
             </w:r>
           </w:p>
         </w:tc>
@@ -1004,7 +1012,7 @@
           </w:tcPr>
           <w:p>
             <w:r>
-              <w:t>Up to 30 s · your script &amp; voiceover · animation, captions, music &amp; SFX · 1 revision · 2 days</w:t>
+              <w:t>Your script &amp; voiceover · animation, captions, music &amp; SFX · 1 revision · 2 days</w:t>
             </w:r>
           </w:p>
         </w:tc>
@@ -1026,7 +1034,7 @@
           </w:tcPr>
           <w:p>
             <w:r>
-              <w:t>$60</w:t>
+              <w:t>$40/min</w:t>
             </w:r>
           </w:p>
         </w:tc>
@@ -1036,7 +1044,7 @@
           </w:tcPr>
           <w:p>
             <w:r>
-              <w:t>Up to 60 s · script polish + AI narrator · captions, music &amp; SFX · 2 revisions · 2 days</w:t>
+              <w:t>Script polish + AI narrator · captions, music &amp; SFX · 2 revisions · 2 days</w:t>
             </w:r>
           </w:p>
         </w:tc>
@@ -1058,7 +1066,7 @@
           </w:tcPr>
           <w:p>
             <w:r>
-              <w:t>$90</w:t>
+              <w:t>$45/min</w:t>
             </w:r>
           </w:p>
         </w:tc>
@@ -1068,7 +1076,7 @@
           </w:tcPr>
           <w:p>
             <w:r>
-              <w:t>Up to 90 s · script written from your topic · premium narrator · cover image · 3 revisions · 3 days</w:t>
+              <w:t>Script written from your topic · premium narrator · cover image · 3 revisions · 3 days</w:t>
             </w:r>
           </w:p>
         </w:tc>
@@ -1083,12 +1091,20 @@
         <w:t xml:space="preserve">Bulk / retainer: </w:t>
       </w:r>
       <w:r>
-        <w:t>Monthly bundles: 10 Shorts for $500 (≈$50 each) · 30 Shorts for $1,350 (≈$45 each).</w:t>
+        <w:t>Priced per finished minute. For monthly volume deals, ask Jahanzeb for a quote.</w:t>
       </w:r>
     </w:p>
     <w:p>
       <w:r>
         <w:br w:type="page"/>
+      </w:r>
+    </w:p>
+    <w:p>
+      <w:r>
+        <w:rPr>
+          <w:b/>
+        </w:rPr>
+        <w:t>PART 1 · STICKMAN POV ANIMATION · SECTION 2 OF 2: LONG-FORM</w:t>
       </w:r>
     </w:p>
     <w:p>
@@ -1099,7 +1115,7 @@
         <w:rPr>
           <w:color w:val="C0322A"/>
         </w:rPr>
-        <w:t>02. Second-Person “POV: You're…” Animated Story Videos</w:t>
+        <w:t>02. Long-Form Stickman POV Animated Videos</w:t>
       </w:r>
     </w:p>
     <w:p>
@@ -1151,7 +1167,7 @@
       <w:r>
         <w:drawing>
           <wp:inline xmlns:a="http://schemas.openxmlformats.org/drawingml/2006/main" xmlns:pic="http://schemas.openxmlformats.org/drawingml/2006/picture">
-            <wp:extent cx="2951999" cy="1746685"/>
+            <wp:extent cx="2951999" cy="1671173"/>
             <wp:docPr id="5" name="Picture 5"/>
             <wp:cNvGraphicFramePr>
               <a:graphicFrameLocks noChangeAspect="1"/>
@@ -1172,7 +1188,7 @@
                   <pic:spPr>
                     <a:xfrm>
                       <a:off x="0" y="0"/>
-                      <a:ext cx="2951999" cy="1746685"/>
+                      <a:ext cx="2951999" cy="1671173"/>
                     </a:xfrm>
                     <a:prstGeom prst="rect"/>
                   </pic:spPr>
@@ -1191,7 +1207,7 @@
         <w:rPr>
           <w:i/>
         </w:rPr>
-        <w:t>From our finished 8.5-minute video “POV: DUNKI”: the thumbnail and four scenes.</w:t>
+        <w:t>From our long-form video “POV: You're a Dictator's Personal Bodyguard”: the thumbnail and four scenes (banquet, freeze frame, rule card, TV news).</w:t>
       </w:r>
     </w:p>
     <w:p>
@@ -1207,7 +1223,7 @@
     </w:p>
     <w:p>
       <w:r>
-        <w:t>Full YouTube videos told in second person and present tense (“You step forward.”), the format used by big story-animation channels. A cold-open hook drops the viewer into the most dangerous moment. Then a “3 years earlier…” rewind tells the story in order, with a twist and an ironic ending. The visuals use the same rough stickman style with mood-based colour palettes, maps, documents, stamps, freeze frames, rewind effects, counters and title cards. The music and Foley are cut to every beat. The client gets the video in sections, a thumbnail, and an optional Premiere Pro timeline file.</w:t>
+        <w:t>Full YouTube POV videos told from the viewer's point of view in the present tense (“You step forward.”), the format used by big story-animation channels. A cold-open hook drops the viewer into the most dangerous moment. Then a “3 years earlier…” rewind tells the story in order, with a twist and an ironic ending. The visuals use the same rough stickman style with mood-based colour palettes, maps, documents, stamps, freeze frames, rewind effects, counters and title cards. The music and Foley are cut to every beat. The client gets the video in sections, a thumbnail, and an optional Premiere Pro timeline file.</w:t>
       </w:r>
     </w:p>
     <w:p>
@@ -1226,7 +1242,7 @@
         <w:rPr>
           <w:b/>
         </w:rPr>
-        <w:t>I turn your script into an 8–10 minute “POV: You're…” animated story video in the hand-drawn stickman style that big story channels use. You get full scenes, voiceover, music, SFX and a thumbnail in 5–7 days. Your channel gets a consistent weekly look without hiring an animation team.</w:t>
+        <w:t>I turn your script into an 8-minute “POV: You're…” animated story video in the hand-drawn stickman style that big story channels use, for $30 per minute ($240 for 8 minutes). You get full scenes, voiceover, music, SFX and a thumbnail in 5–10 days. Your channel gets a consistent weekly look without hiring an animation team.</w:t>
       </w:r>
     </w:p>
     <w:p>
@@ -1242,7 +1258,7 @@
     </w:p>
     <w:p>
       <w:r>
-        <w:t>Hi [Name], I produce second-person animated story videos (“POV: You're a…”) end to end. I can write the script with a cold-open hook, a rewind and a twist ending, voice it, animate every scene and cut music and sound effects to each beat. You review it section by section. You also see frames before anything is fully rendered. I just finished an 8.5-minute story video this way and can share it. Are you looking for one video, or a weekly upload partner?</w:t>
+        <w:t>Hi [Name], I produce long-form POV animated story videos (“POV: You're a…”) end to end. I can write the script with a cold-open hook, a rewind and a twist ending, voice it, animate every scene and cut music and sound effects to each beat. You review it section by section. You also see frames before anything is fully rendered. I just finished an 8:45 video this way, “POV: You're a Dictator's Personal Bodyguard”, and can share it. Are you looking for one video, or a weekly upload partner?</w:t>
       </w:r>
     </w:p>
     <w:p>
@@ -1293,7 +1309,7 @@
     </w:p>
     <w:p>
       <w:r>
-        <w:t>second person story videos, POV story animation, POV you're videos, animated story videos, faceless YouTube channel, YouTube automation videos, cash cow YouTube, 2D story animation, stickman story animation, animated documentary, edutainment animation, history animation, hypothetical scenario videos, what if story videos, true story animation, crime story animation, survival story animation, job POV videos, animated narration video, script to animated video, long-form YouTube animation, 2D explainer video, YouTube channel animation, Urdu animation, animated storytelling for YouTube, faceless content creator</w:t>
+        <w:t>long-form POV videos, POV story animation, POV you're videos, animated story videos, faceless YouTube channel, YouTube automation videos, cash cow YouTube, 2D story animation, stickman story animation, animated documentary, edutainment animation, history animation, hypothetical scenario videos, what if story videos, true story animation, crime story animation, survival story animation, job POV videos, animated narration video, script to animated video, long-form YouTube animation, 2D explainer video, YouTube channel animation, Urdu animation, animated storytelling for YouTube, faceless content creator</w:t>
       </w:r>
     </w:p>
     <w:p>
@@ -1336,7 +1352,7 @@
         <w:pStyle w:val="ListBullet"/>
       </w:pPr>
       <w:r>
-        <w:t>Urdu / South Asian channels that want local stories (we do Urdu voiceover and local details)</w:t>
+        <w:t>Channels in any niche that want English or Urdu narration</w:t>
       </w:r>
     </w:p>
     <w:p>
@@ -1355,7 +1371,7 @@
         <w:pStyle w:val="ListBullet"/>
       </w:pPr>
       <w:r>
-        <w:t>Fiverr: I will create a POV second person animated story video for your YouTube channel</w:t>
+        <w:t>Fiverr: I will create a long form POV animated story video for your YouTube channel</w:t>
       </w:r>
     </w:p>
     <w:p>
@@ -1444,7 +1460,7 @@
           </w:tcPr>
           <w:p>
             <w:r>
-              <w:t>Basic</w:t>
+              <w:t>Rate</w:t>
             </w:r>
           </w:p>
         </w:tc>
@@ -1454,7 +1470,7 @@
           </w:tcPr>
           <w:p>
             <w:r>
-              <w:t>$180</w:t>
+              <w:t>$30/min</w:t>
             </w:r>
           </w:p>
         </w:tc>
@@ -1464,7 +1480,7 @@
           </w:tcPr>
           <w:p>
             <w:r>
-              <w:t>Up to 5 min · your script &amp; voiceover · full animation, music &amp; SFX · 1 revision · 5 days</w:t>
+              <w:t>Any length, billed per finished minute · full animation, AI narrator, music &amp; SFX · thumbnail</w:t>
             </w:r>
           </w:p>
         </w:tc>
@@ -1476,7 +1492,7 @@
           </w:tcPr>
           <w:p>
             <w:r>
-              <w:t>Standard</w:t>
+              <w:t>8-min video</w:t>
             </w:r>
           </w:p>
         </w:tc>
@@ -1486,7 +1502,7 @@
           </w:tcPr>
           <w:p>
             <w:r>
-              <w:t>$300</w:t>
+              <w:t>$240</w:t>
             </w:r>
           </w:p>
         </w:tc>
@@ -1496,7 +1512,7 @@
           </w:tcPr>
           <w:p>
             <w:r>
-              <w:t>8–10 min · your script · AI narrator, music &amp; SFX · thumbnail · 2 revisions · 7 days</w:t>
+              <w:t>Our standard length · full package as above · 2 revisions · 5–10 days</w:t>
             </w:r>
           </w:p>
         </w:tc>
@@ -1508,7 +1524,7 @@
           </w:tcPr>
           <w:p>
             <w:r>
-              <w:t>Premium</w:t>
+              <w:t>Examples</w:t>
             </w:r>
           </w:p>
         </w:tc>
@@ -1517,9 +1533,7 @@
             <w:tcW w:type="dxa" w:w="3324"/>
           </w:tcPr>
           <w:p>
-            <w:r>
-              <w:t>$450</w:t>
-            </w:r>
+            <w:r/>
           </w:p>
         </w:tc>
         <w:tc>
@@ -1528,7 +1542,7 @@
           </w:tcPr>
           <w:p>
             <w:r>
-              <w:t>10–12 min · script written from your topic · narrator · thumbnail · 2 Shorts cut-downs · Premiere timeline · 3 revisions · 7–10 days</w:t>
+              <w:t>5 min = $150 · 10 min = $300 · 12 min = $360</w:t>
             </w:r>
           </w:p>
         </w:tc>
@@ -1543,12 +1557,20 @@
         <w:t xml:space="preserve">Bulk / retainer: </w:t>
       </w:r>
       <w:r>
-        <w:t>Weekly upload partner: 4 videos per month for $1,100–$1,600, depending on length. Rule of thumb: about $30–40 per finished minute.</w:t>
+        <w:t>Weekly upload partner: 4 videos a month at the same $30 per minute (4 × 8 min = $960).</w:t>
       </w:r>
     </w:p>
     <w:p>
       <w:r>
         <w:br w:type="page"/>
+      </w:r>
+    </w:p>
+    <w:p>
+      <w:r>
+        <w:rPr>
+          <w:b/>
+        </w:rPr>
+        <w:t>PART 2 · 3D ANIMATION</w:t>
       </w:r>
     </w:p>
     <w:p>
@@ -1741,7 +1763,7 @@
     </w:p>
     <w:p>
       <w:r>
-        <w:t>Viral-style vertical 3D Shorts built around an absurd “what if” premise. A natural thing becomes a person with a job or feelings: gravity gets fired, the moon goes on strike, the Earth gets dizzy. The look is flat-shaded, low-poly 3D with soft shadows, warm colours and painterly skies. A recurring cast of characters makes it feel like a series. Every Short opens on action in frame 1, escalates line by line, includes one real science fact so people share it, and ends on a loop or a twist. Each one comes with a deadpan narrator, bold word-by-word captions, a music bed and SFX on every gag. Our best one so far got 20K views in 36 hours with 102% retention.</w:t>
+        <w:t>Viral-style vertical 3D Shorts built around an absurd “what if” premise. A natural thing becomes a person with a job or feelings: gravity gets fired, the moon goes on strike, the Earth gets dizzy. The look is flat-shaded, low-poly 3D with soft shadows, warm colours and painterly skies. A recurring cast of characters makes it feel like a series. Every Short opens on action in frame 1, escalates line by line, includes one real science fact so people share it, and ends on a loop or a twist. Each one comes with a deadpan narrator, bold word-by-word captions, a music bed and SFX on every gag. Our best one so far reached 102% retention (viewers watched to the end and replayed it).</w:t>
       </w:r>
     </w:p>
     <w:p>
@@ -1760,7 +1782,7 @@
         <w:rPr>
           <w:b/>
         </w:rPr>
-        <w:t>“What if the moon went on strike?” That kind of 3D Short got 20K views in 36 hours with 102% retention on my own channel. I make low-poly 3D what-if Shorts end to end, from script and narration to animation, captions and sound. They start at $80 per Short and arrive in 3 days.</w:t>
+        <w:t>“What if the moon went on strike?” That kind of 3D Short reached 102% retention on my own channel, so viewers watched it to the end and replayed it. I make low-poly 3D what-if Shorts end to end, from script and narration to animation, captions and sound. $50 per Short, delivered in 3 days.</w:t>
       </w:r>
     </w:p>
     <w:p>
@@ -1776,7 +1798,7 @@
     </w:p>
     <w:p>
       <w:r>
-        <w:t>Hi [Name], your audience would love a 3D “what if” series built on your topics. I make low-poly animated Shorts where everyday things come alive (planets, clouds, objects, even your mascot). Every one has a hook in the first frame, escalating gags, one real fact and a loop ending that drives rewatches. One of mine got 20K views in 36 hours with 102% retention. Should I pitch you 3 episode ideas for your channel?</w:t>
+        <w:t>Hi [Name], your audience would love a 3D “what if” series built on your topics. I make low-poly animated Shorts where everyday things come alive (planets, clouds, objects, even your mascot). Every one has a hook in the first frame, escalating gags, one real fact and a loop ending that drives rewatches. One of mine reached 102% retention. Should I pitch you 3 episode ideas for your channel?</w:t>
       </w:r>
     </w:p>
     <w:p>
@@ -1978,7 +2000,7 @@
           </w:tcPr>
           <w:p>
             <w:r>
-              <w:t>Basic</w:t>
+              <w:t>Per Short</w:t>
             </w:r>
           </w:p>
         </w:tc>
@@ -1998,71 +2020,7 @@
           </w:tcPr>
           <w:p>
             <w:r>
-              <w:t>Up to 30 s · your script &amp; voiceover · 3D animation, captions, music &amp; SFX · 1 revision · 3 days</w:t>
-            </w:r>
-          </w:p>
-        </w:tc>
-      </w:tr>
-      <w:tr>
-        <w:tc>
-          <w:tcPr>
-            <w:tcW w:type="dxa" w:w="3324"/>
-          </w:tcPr>
-          <w:p>
-            <w:r>
-              <w:t>Standard</w:t>
-            </w:r>
-          </w:p>
-        </w:tc>
-        <w:tc>
-          <w:tcPr>
-            <w:tcW w:type="dxa" w:w="3324"/>
-          </w:tcPr>
-          <w:p>
-            <w:r>
-              <w:t>$80</w:t>
-            </w:r>
-          </w:p>
-        </w:tc>
-        <w:tc>
-          <w:tcPr>
-            <w:tcW w:type="dxa" w:w="3324"/>
-          </w:tcPr>
-          <w:p>
-            <w:r>
-              <w:t>Up to 60 s · script + narrator · captions, music &amp; SFX · 2 revisions · 3 days</w:t>
-            </w:r>
-          </w:p>
-        </w:tc>
-      </w:tr>
-      <w:tr>
-        <w:tc>
-          <w:tcPr>
-            <w:tcW w:type="dxa" w:w="3324"/>
-          </w:tcPr>
-          <w:p>
-            <w:r>
-              <w:t>Premium</w:t>
-            </w:r>
-          </w:p>
-        </w:tc>
-        <w:tc>
-          <w:tcPr>
-            <w:tcW w:type="dxa" w:w="3324"/>
-          </w:tcPr>
-          <w:p>
-            <w:r>
-              <w:t>$120</w:t>
-            </w:r>
-          </w:p>
-        </w:tc>
-        <w:tc>
-          <w:tcPr>
-            <w:tcW w:type="dxa" w:w="3324"/>
-          </w:tcPr>
-          <w:p>
-            <w:r>
-              <w:t>Up to 60 s · custom character / mascot / brand colours · 2 hook variants · 3 revisions · 4 days</w:t>
+              <w:t>Up to 60 s · script + narrator · 3D animation · captions, music &amp; SFX · 2 revisions · 2–4 days</w:t>
             </w:r>
           </w:p>
         </w:tc>
@@ -2077,12 +2035,20 @@
         <w:t xml:space="preserve">Bulk / retainer: </w:t>
       </w:r>
       <w:r>
-        <w:t>Monthly series: 10 Shorts for $700 (≈$70 each). Recurring characters stay consistent across the series.</w:t>
+        <w:t>Monthly series: $50 per Short. Recurring characters stay consistent across the series. Custom mascots or brand characters: ask Jahanzeb for a quote.</w:t>
       </w:r>
     </w:p>
     <w:p>
       <w:r>
         <w:br w:type="page"/>
+      </w:r>
+    </w:p>
+    <w:p>
+      <w:r>
+        <w:rPr>
+          <w:b/>
+        </w:rPr>
+        <w:t>PART 3 · PREMIUM BLENDER 3D</w:t>
       </w:r>
     </w:p>
     <w:p>
@@ -2795,7 +2761,7 @@
         <w:pStyle w:val="ListBullet"/>
       </w:pPr>
       <w:r>
-        <w:t>Results post: “This 3D Short got 20K views in 36 hours with 102% retention. Here's why it worked” (hook, escalation, loop).</w:t>
+        <w:t>Results post: “This 3D Short hit 102% retention. Here's why it worked” (hook, escalation, loop).</w:t>
       </w:r>
     </w:p>
     <w:p>
@@ -2886,7 +2852,7 @@
           </w:tcPr>
           <w:p>
             <w:r>
-              <w:t>“POV: DUNKI” (long-form Urdu story video)</w:t>
+              <w:t>“POV: You're a Dictator's Personal Bodyguard” (long-form POV video)</w:t>
             </w:r>
           </w:p>
         </w:tc>

</xml_diff>